<commit_message>
chore(new program): Le projet change totalement, maintenant c'est un task manager
</commit_message>
<xml_diff>
--- a/CDC/Projet_Personnelle_CDC.docx
+++ b/CDC/Projet_Personnelle_CDC.docx
@@ -33,12 +33,21 @@
           <w:szCs w:val="56"/>
         </w:rPr>
       </w:pPr>
+      <w:proofErr w:type="spellStart"/>
       <w:r>
         <w:rPr>
           <w:sz w:val="56"/>
           <w:szCs w:val="56"/>
         </w:rPr>
-        <w:t>World tour</w:t>
+        <w:t>Task</w:t>
+      </w:r>
+      <w:proofErr w:type="spellEnd"/>
+      <w:r>
+        <w:rPr>
+          <w:sz w:val="56"/>
+          <w:szCs w:val="56"/>
+        </w:rPr>
+        <w:t xml:space="preserve"> Note</w:t>
       </w:r>
     </w:p>
     <w:p>
@@ -56,9 +65,9 @@
           <w:szCs w:val="72"/>
         </w:rPr>
         <w:drawing>
-          <wp:inline distT="0" distB="0" distL="0" distR="0" wp14:anchorId="016E0770" wp14:editId="1FE0ED50">
-            <wp:extent cx="5760720" cy="3840480"/>
-            <wp:effectExtent l="0" t="0" r="0" b="7620"/>
+          <wp:inline distT="0" distB="0" distL="0" distR="0" wp14:anchorId="016E0770" wp14:editId="1238FA2D">
+            <wp:extent cx="2771775" cy="5953663"/>
+            <wp:effectExtent l="0" t="0" r="0" b="9525"/>
             <wp:docPr id="846957767" name="Image 1"/>
             <wp:cNvGraphicFramePr>
               <a:graphicFrameLocks xmlns:a="http://schemas.openxmlformats.org/drawingml/2006/main" noChangeAspect="1"/>
@@ -67,7 +76,7 @@
               <a:graphicData uri="http://schemas.openxmlformats.org/drawingml/2006/picture">
                 <pic:pic xmlns:pic="http://schemas.openxmlformats.org/drawingml/2006/picture">
                   <pic:nvPicPr>
-                    <pic:cNvPr id="846957767" name="Image 846957767"/>
+                    <pic:cNvPr id="846957767" name="Image 1"/>
                     <pic:cNvPicPr/>
                   </pic:nvPicPr>
                   <pic:blipFill>
@@ -85,7 +94,7 @@
                   <pic:spPr>
                     <a:xfrm>
                       <a:off x="0" y="0"/>
-                      <a:ext cx="5760720" cy="3840480"/>
+                      <a:ext cx="2775094" cy="5960792"/>
                     </a:xfrm>
                     <a:prstGeom prst="rect">
                       <a:avLst/>
@@ -163,8 +172,33 @@
           <w:sz w:val="52"/>
           <w:szCs w:val="52"/>
         </w:rPr>
-        <w:t>Pouvoir se déplacer dans un monde et changer de monde</w:t>
-      </w:r>
+        <w:t xml:space="preserve">Avoir un bon </w:t>
+      </w:r>
+      <w:proofErr w:type="spellStart"/>
+      <w:r>
+        <w:rPr>
+          <w:sz w:val="52"/>
+          <w:szCs w:val="52"/>
+        </w:rPr>
+        <w:t>Ui</w:t>
+      </w:r>
+      <w:proofErr w:type="spellEnd"/>
+      <w:r>
+        <w:rPr>
+          <w:sz w:val="52"/>
+          <w:szCs w:val="52"/>
+        </w:rPr>
+        <w:t>/</w:t>
+      </w:r>
+      <w:proofErr w:type="spellStart"/>
+      <w:r>
+        <w:rPr>
+          <w:sz w:val="52"/>
+          <w:szCs w:val="52"/>
+        </w:rPr>
+        <w:t>Ux</w:t>
+      </w:r>
+      <w:proofErr w:type="spellEnd"/>
     </w:p>
     <w:p>
       <w:pPr>
@@ -183,7 +217,7 @@
           <w:sz w:val="52"/>
           <w:szCs w:val="52"/>
         </w:rPr>
-        <w:t>Avoir un petit personnage qui nous suis à la trace</w:t>
+        <w:t>Pouvoir visionner des tâches</w:t>
       </w:r>
     </w:p>
     <w:p>
@@ -203,7 +237,7 @@
           <w:sz w:val="52"/>
           <w:szCs w:val="52"/>
         </w:rPr>
-        <w:t>Des musiques qui s’activent selon le monde ou l’action que l’on fait</w:t>
+        <w:t>Pouvoir Cocher des cases</w:t>
       </w:r>
     </w:p>
     <w:p>
@@ -223,17 +257,48 @@
           <w:sz w:val="52"/>
           <w:szCs w:val="52"/>
         </w:rPr>
-        <w:t xml:space="preserve">Maquette sur </w:t>
-      </w:r>
-      <w:proofErr w:type="spellStart"/>
-      <w:r>
-        <w:rPr>
-          <w:sz w:val="52"/>
-          <w:szCs w:val="52"/>
-        </w:rPr>
-        <w:t>figma</w:t>
-      </w:r>
-      <w:proofErr w:type="spellEnd"/>
+        <w:t>Pouvoir Supprimer une tâche</w:t>
+      </w:r>
+    </w:p>
+    <w:p>
+      <w:pPr>
+        <w:pStyle w:val="Paragraphedeliste"/>
+        <w:numPr>
+          <w:ilvl w:val="0"/>
+          <w:numId w:val="1"/>
+        </w:numPr>
+        <w:rPr>
+          <w:sz w:val="52"/>
+          <w:szCs w:val="52"/>
+        </w:rPr>
+      </w:pPr>
+      <w:r>
+        <w:rPr>
+          <w:sz w:val="52"/>
+          <w:szCs w:val="52"/>
+        </w:rPr>
+        <w:t>Pouvoir ajouter une tâche</w:t>
+      </w:r>
+    </w:p>
+    <w:p>
+      <w:pPr>
+        <w:pStyle w:val="Paragraphedeliste"/>
+        <w:numPr>
+          <w:ilvl w:val="0"/>
+          <w:numId w:val="1"/>
+        </w:numPr>
+        <w:rPr>
+          <w:sz w:val="52"/>
+          <w:szCs w:val="52"/>
+        </w:rPr>
+      </w:pPr>
+      <w:r>
+        <w:rPr>
+          <w:sz w:val="52"/>
+          <w:szCs w:val="52"/>
+        </w:rPr>
+        <w:t>Voir le nombre de tâches complété</w:t>
+      </w:r>
     </w:p>
     <w:p>
       <w:pPr>
@@ -318,6 +383,91 @@
         </w:rPr>
         <w:t>Internet</w:t>
       </w:r>
+    </w:p>
+    <w:p>
+      <w:pPr>
+        <w:rPr>
+          <w:sz w:val="52"/>
+          <w:szCs w:val="52"/>
+        </w:rPr>
+      </w:pPr>
+    </w:p>
+    <w:p>
+      <w:pPr>
+        <w:ind w:left="2124" w:firstLine="708"/>
+        <w:rPr>
+          <w:sz w:val="52"/>
+          <w:szCs w:val="52"/>
+        </w:rPr>
+      </w:pPr>
+      <w:r>
+        <w:rPr>
+          <w:sz w:val="52"/>
+          <w:szCs w:val="52"/>
+        </w:rPr>
+        <w:t>Si le temps le permet :</w:t>
+      </w:r>
+    </w:p>
+    <w:p>
+      <w:pPr>
+        <w:pStyle w:val="Paragraphedeliste"/>
+        <w:numPr>
+          <w:ilvl w:val="0"/>
+          <w:numId w:val="3"/>
+        </w:numPr>
+        <w:rPr>
+          <w:sz w:val="52"/>
+          <w:szCs w:val="52"/>
+        </w:rPr>
+      </w:pPr>
+      <w:r>
+        <w:rPr>
+          <w:sz w:val="52"/>
+          <w:szCs w:val="52"/>
+        </w:rPr>
+        <w:t xml:space="preserve">Faire en </w:t>
+      </w:r>
+      <w:proofErr w:type="spellStart"/>
+      <w:r>
+        <w:rPr>
+          <w:sz w:val="52"/>
+          <w:szCs w:val="52"/>
+        </w:rPr>
+        <w:t>kotline</w:t>
+      </w:r>
+      <w:proofErr w:type="spellEnd"/>
+      <w:r>
+        <w:rPr>
+          <w:sz w:val="52"/>
+          <w:szCs w:val="52"/>
+        </w:rPr>
+        <w:t xml:space="preserve"> pour </w:t>
+      </w:r>
+      <w:proofErr w:type="spellStart"/>
+      <w:r>
+        <w:rPr>
+          <w:sz w:val="52"/>
+          <w:szCs w:val="52"/>
+        </w:rPr>
+        <w:t>android</w:t>
+      </w:r>
+      <w:proofErr w:type="spellEnd"/>
+      <w:r>
+        <w:rPr>
+          <w:sz w:val="52"/>
+          <w:szCs w:val="52"/>
+        </w:rPr>
+        <w:t xml:space="preserve"> ou trouver un moyen de faire la traduction</w:t>
+      </w:r>
+    </w:p>
+    <w:p>
+      <w:pPr>
+        <w:ind w:left="3540"/>
+        <w:rPr>
+          <w:sz w:val="52"/>
+          <w:szCs w:val="52"/>
+        </w:rPr>
+      </w:pPr>
     </w:p>
     <w:sectPr>
       <w:pgSz w:w="11906" w:h="16838"/>
@@ -421,6 +571,95 @@
     </w:lvl>
   </w:abstractNum>
   <w:abstractNum w:abstractNumId="1" w15:restartNumberingAfterBreak="0">
+    <w:nsid w:val="30224CEE"/>
+    <w:multiLevelType w:val="hybridMultilevel"/>
+    <w:tmpl w:val="FA3803DC"/>
+    <w:lvl w:ilvl="0" w:tplc="7E483718">
+      <w:start w:val="1"/>
+      <w:numFmt w:val="decimal"/>
+      <w:lvlText w:val="%1."/>
+      <w:lvlJc w:val="left"/>
+      <w:pPr>
+        <w:ind w:left="1080" w:hanging="720"/>
+      </w:pPr>
+      <w:rPr>
+        <w:rFonts w:hint="default"/>
+      </w:rPr>
+    </w:lvl>
+    <w:lvl w:ilvl="1" w:tplc="100C0019" w:tentative="1">
+      <w:start w:val="1"/>
+      <w:numFmt w:val="lowerLetter"/>
+      <w:lvlText w:val="%2."/>
+      <w:lvlJc w:val="left"/>
+      <w:pPr>
+        <w:ind w:left="1440" w:hanging="360"/>
+      </w:pPr>
+    </w:lvl>
+    <w:lvl w:ilvl="2" w:tplc="100C001B" w:tentative="1">
+      <w:start w:val="1"/>
+      <w:numFmt w:val="lowerRoman"/>
+      <w:lvlText w:val="%3."/>
+      <w:lvlJc w:val="right"/>
+      <w:pPr>
+        <w:ind w:left="2160" w:hanging="180"/>
+      </w:pPr>
+    </w:lvl>
+    <w:lvl w:ilvl="3" w:tplc="100C000F" w:tentative="1">
+      <w:start w:val="1"/>
+      <w:numFmt w:val="decimal"/>
+      <w:lvlText w:val="%4."/>
+      <w:lvlJc w:val="left"/>
+      <w:pPr>
+        <w:ind w:left="2880" w:hanging="360"/>
+      </w:pPr>
+    </w:lvl>
+    <w:lvl w:ilvl="4" w:tplc="100C0019" w:tentative="1">
+      <w:start w:val="1"/>
+      <w:numFmt w:val="lowerLetter"/>
+      <w:lvlText w:val="%5."/>
+      <w:lvlJc w:val="left"/>
+      <w:pPr>
+        <w:ind w:left="3600" w:hanging="360"/>
+      </w:pPr>
+    </w:lvl>
+    <w:lvl w:ilvl="5" w:tplc="100C001B" w:tentative="1">
+      <w:start w:val="1"/>
+      <w:numFmt w:val="lowerRoman"/>
+      <w:lvlText w:val="%6."/>
+      <w:lvlJc w:val="right"/>
+      <w:pPr>
+        <w:ind w:left="4320" w:hanging="180"/>
+      </w:pPr>
+    </w:lvl>
+    <w:lvl w:ilvl="6" w:tplc="100C000F" w:tentative="1">
+      <w:start w:val="1"/>
+      <w:numFmt w:val="decimal"/>
+      <w:lvlText w:val="%7."/>
+      <w:lvlJc w:val="left"/>
+      <w:pPr>
+        <w:ind w:left="5040" w:hanging="360"/>
+      </w:pPr>
+    </w:lvl>
+    <w:lvl w:ilvl="7" w:tplc="100C0019" w:tentative="1">
+      <w:start w:val="1"/>
+      <w:numFmt w:val="lowerLetter"/>
+      <w:lvlText w:val="%8."/>
+      <w:lvlJc w:val="left"/>
+      <w:pPr>
+        <w:ind w:left="5760" w:hanging="360"/>
+      </w:pPr>
+    </w:lvl>
+    <w:lvl w:ilvl="8" w:tplc="100C001B" w:tentative="1">
+      <w:start w:val="1"/>
+      <w:numFmt w:val="lowerRoman"/>
+      <w:lvlText w:val="%9."/>
+      <w:lvlJc w:val="right"/>
+      <w:pPr>
+        <w:ind w:left="6480" w:hanging="180"/>
+      </w:pPr>
+    </w:lvl>
+  </w:abstractNum>
+  <w:abstractNum w:abstractNumId="2" w15:restartNumberingAfterBreak="0">
     <w:nsid w:val="41243711"/>
     <w:multiLevelType w:val="hybridMultilevel"/>
     <w:tmpl w:val="AB44D80A"/>
@@ -510,10 +749,13 @@
     </w:lvl>
   </w:abstractNum>
   <w:num w:numId="1" w16cid:durableId="623731110">
-    <w:abstractNumId w:val="1"/>
+    <w:abstractNumId w:val="2"/>
   </w:num>
   <w:num w:numId="2" w16cid:durableId="476535757">
     <w:abstractNumId w:val="0"/>
+  </w:num>
+  <w:num w:numId="3" w16cid:durableId="1215196982">
+    <w:abstractNumId w:val="1"/>
   </w:num>
 </w:numbering>
 </file>

</xml_diff>